<commit_message>
spec: regenerate .docx mirrors for AS-BUILT-corrected iteration specs (full re-sync phase 1)
Co-Authored-By: Claude Opus 4.8 <noreply@anthropic.com>
</commit_message>
<xml_diff>
--- a/0002_qr_invitation_system/0002_qr_invitation_system.docx
+++ b/0002_qr_invitation_system/0002_qr_invitation_system.docx
@@ -2,13 +2,295 @@
 <file path=word/document.xml><?xml version="1.0" encoding="utf-8"?>
 <w:document xmlns:w="http://schemas.openxmlformats.org/wordprocessingml/2006/main" xmlns:m="http://schemas.openxmlformats.org/officeDocument/2006/math" xmlns:r="http://schemas.openxmlformats.org/officeDocument/2006/relationships" xmlns:o="urn:schemas-microsoft-com:office:office" xmlns:v="urn:schemas-microsoft-com:vml" xmlns:w10="urn:schemas-microsoft-com:office:word" xmlns:a="http://schemas.openxmlformats.org/drawingml/2006/main" xmlns:pic="http://schemas.openxmlformats.org/drawingml/2006/picture" xmlns:wp="http://schemas.openxmlformats.org/drawingml/2006/wordprocessingDrawing">
   <w:body>
-    <w:bookmarkStart w:id="83" w:name="guest-qr-code-system-event-landing-page"/>
+    <w:bookmarkStart w:id="84" w:name="guest-qr-code-system-event-landing-page"/>
     <w:p>
       <w:pPr>
         <w:pStyle w:val="Heading1"/>
       </w:pPr>
       <w:r>
         <w:t xml:space="preserve">0002 — Guest QR Code System &amp; Event Landing Page</w:t>
+      </w:r>
+    </w:p>
+    <w:p>
+      <w:pPr>
+        <w:pStyle w:val="Heading2"/>
+      </w:pPr>
+      <w:bookmarkStart w:id="9" w:name="X15fe45fd35a3898cec2809a953f74255a18bbe7"/>
+      <w:r>
+        <w:t xml:space="preserve">WARNING: AS-BUILT CORRECTION — 2026-06-07 (reconciled to live site + origin/main @ 34347c3c)</w:t>
+      </w:r>
+      <w:bookmarkEnd w:id="9"/>
+    </w:p>
+    <w:p>
+      <w:pPr>
+        <w:pStyle w:val="BlockText"/>
+      </w:pPr>
+      <w:r>
+        <w:rPr>
+          <w:b/>
+          <w:bCs/>
+        </w:rPr>
+        <w:t xml:space="preserve">This spec is HISTORICAL.</w:t>
+      </w:r>
+      <w:r>
+        <w:t xml:space="preserve"> </w:t>
+      </w:r>
+      <w:r>
+        <w:t xml:space="preserve">Authoritative current state = the live site (www.setnayan.com) + shipped code +</w:t>
+      </w:r>
+      <w:r>
+        <w:t xml:space="preserve"> </w:t>
+      </w:r>
+      <w:r>
+        <w:rPr>
+          <w:rStyle w:val="VerbatimChar"/>
+        </w:rPr>
+        <w:t xml:space="preserve">AS_BUILT_GROUND_TRUTH_2026-06-07.md</w:t>
+      </w:r>
+      <w:r>
+        <w:t xml:space="preserve">. Deltas vs what actually shipped:</w:t>
+      </w:r>
+      <w:r>
+        <w:t xml:space="preserve"> </w:t>
+      </w:r>
+      <w:r>
+        <w:t xml:space="preserve">-</w:t>
+      </w:r>
+      <w:r>
+        <w:t xml:space="preserve"> </w:t>
+      </w:r>
+      <w:r>
+        <w:rPr>
+          <w:b/>
+          <w:bCs/>
+        </w:rPr>
+        <w:t xml:space="preserve">The free per-event landing page + guest QR +</w:t>
+      </w:r>
+      <w:r>
+        <w:rPr>
+          <w:b/>
+          <w:bCs/>
+        </w:rPr>
+        <w:t xml:space="preserve"> </w:t>
+      </w:r>
+      <w:r>
+        <w:rPr>
+          <w:rStyle w:val="VerbatimChar"/>
+          <w:b/>
+          <w:bCs/>
+        </w:rPr>
+        <w:t xml:space="preserve">?invite=[token]</w:t>
+      </w:r>
+      <w:r>
+        <w:rPr>
+          <w:b/>
+          <w:bCs/>
+        </w:rPr>
+        <w:t xml:space="preserve"> </w:t>
+      </w:r>
+      <w:r>
+        <w:rPr>
+          <w:b/>
+          <w:bCs/>
+        </w:rPr>
+        <w:t xml:space="preserve">magic-link flow shipped</w:t>
+      </w:r>
+      <w:r>
+        <w:t xml:space="preserve"> </w:t>
+      </w:r>
+      <w:r>
+        <w:t xml:space="preserve">(couple editor under</w:t>
+      </w:r>
+      <w:r>
+        <w:t xml:space="preserve"> </w:t>
+      </w:r>
+      <w:r>
+        <w:rPr>
+          <w:rStyle w:val="VerbatimChar"/>
+        </w:rPr>
+        <w:t xml:space="preserve">/dashboard/[eventId]/invitation</w:t>
+      </w:r>
+      <w:r>
+        <w:t xml:space="preserve"> </w:t>
+      </w:r>
+      <w:r>
+        <w:t xml:space="preserve">+</w:t>
+      </w:r>
+      <w:r>
+        <w:t xml:space="preserve"> </w:t>
+      </w:r>
+      <w:r>
+        <w:rPr>
+          <w:rStyle w:val="VerbatimChar"/>
+        </w:rPr>
+        <w:t xml:space="preserve">/website</w:t>
+      </w:r>
+      <w:r>
+        <w:t xml:space="preserve">; public page at</w:t>
+      </w:r>
+      <w:r>
+        <w:t xml:space="preserve"> </w:t>
+      </w:r>
+      <w:r>
+        <w:rPr>
+          <w:rStyle w:val="VerbatimChar"/>
+        </w:rPr>
+        <w:t xml:space="preserve">/[slug]</w:t>
+      </w:r>
+      <w:r>
+        <w:t xml:space="preserve">; guest</w:t>
+      </w:r>
+      <w:r>
+        <w:t xml:space="preserve"> </w:t>
+      </w:r>
+      <w:r>
+        <w:t xml:space="preserve">“login”</w:t>
+      </w:r>
+      <w:r>
+        <w:t xml:space="preserve"> </w:t>
+      </w:r>
+      <w:r>
+        <w:t xml:space="preserve">= magic invite URL → 60-day guest-session cookie). This is a free planning tool, not a SKU.</w:t>
+      </w:r>
+      <w:r>
+        <w:t xml:space="preserve"> </w:t>
+      </w:r>
+      <w:r>
+        <w:t xml:space="preserve">-</w:t>
+      </w:r>
+      <w:r>
+        <w:t xml:space="preserve"> </w:t>
+      </w:r>
+      <w:r>
+        <w:rPr>
+          <w:b/>
+          <w:bCs/>
+        </w:rPr>
+        <w:t xml:space="preserve">The vendor</w:t>
+      </w:r>
+      <w:r>
+        <w:rPr>
+          <w:b/>
+          <w:bCs/>
+        </w:rPr>
+        <w:t xml:space="preserve"> </w:t>
+      </w:r>
+      <w:r>
+        <w:rPr>
+          <w:b/>
+          <w:bCs/>
+        </w:rPr>
+        <w:t xml:space="preserve">“scan event master QR → TIER 1 verified-booking / TIER 2 self-claim”</w:t>
+      </w:r>
+      <w:r>
+        <w:rPr>
+          <w:b/>
+          <w:bCs/>
+        </w:rPr>
+        <w:t xml:space="preserve"> </w:t>
+      </w:r>
+      <w:r>
+        <w:rPr>
+          <w:b/>
+          <w:bCs/>
+        </w:rPr>
+        <w:t xml:space="preserve">flow described here depends on a settled</w:t>
+      </w:r>
+      <w:r>
+        <w:rPr>
+          <w:b/>
+          <w:bCs/>
+        </w:rPr>
+        <w:t xml:space="preserve"> </w:t>
+      </w:r>
+      <w:r>
+        <w:rPr>
+          <w:b/>
+          <w:bCs/>
+        </w:rPr>
+        <w:t xml:space="preserve">“Setnayan Pay order”</w:t>
+      </w:r>
+      <w:r>
+        <w:rPr>
+          <w:b/>
+          <w:bCs/>
+        </w:rPr>
+        <w:t xml:space="preserve"> </w:t>
+      </w:r>
+      <w:r>
+        <w:rPr>
+          <w:b/>
+          <w:bCs/>
+        </w:rPr>
+        <w:t xml:space="preserve">— that premise is RETIRED.</w:t>
+      </w:r>
+      <w:r>
+        <w:t xml:space="preserve"> </w:t>
+      </w:r>
+      <w:r>
+        <w:t xml:space="preserve">Setnayan takes</w:t>
+      </w:r>
+      <w:r>
+        <w:t xml:space="preserve"> </w:t>
+      </w:r>
+      <w:r>
+        <w:rPr>
+          <w:b/>
+          <w:bCs/>
+        </w:rPr>
+        <w:t xml:space="preserve">0% commission</w:t>
+      </w:r>
+      <w:r>
+        <w:t xml:space="preserve"> </w:t>
+      </w:r>
+      <w:r>
+        <w:t xml:space="preserve">and never holds vendor↔customer money (off-platform, RA 11967), so there is no settled Setnayan-Pay transaction to use as TIER-1 verification. Treat the editorial-credit verification machinery as unbuilt/historical.</w:t>
+      </w:r>
+      <w:r>
+        <w:t xml:space="preserve"> </w:t>
+      </w:r>
+      <w:r>
+        <w:t xml:space="preserve">-</w:t>
+      </w:r>
+      <w:r>
+        <w:t xml:space="preserve"> </w:t>
+      </w:r>
+      <w:r>
+        <w:rPr>
+          <w:b/>
+          <w:bCs/>
+        </w:rPr>
+        <w:t xml:space="preserve">Guest→vendor has no shipped path today</w:t>
+      </w:r>
+      <w:r>
+        <w:t xml:space="preserve"> </w:t>
+      </w:r>
+      <w:r>
+        <w:t xml:space="preserve">(guest reviews unbuilt as of the ground-truth audit); the four-scan-actor model here is forward spec for the parts beyond guest-self-hydration.</w:t>
+      </w:r>
+      <w:r>
+        <w:t xml:space="preserve"> </w:t>
+      </w:r>
+      <w:r>
+        <w:t xml:space="preserve">- The 3-lifecycle-state model (Invitation → Event-proper → Editorial) and the day-of guest LIVE surface (0031) are partially shipped/partially forward — cross-check 0031 + the gallery surfaces before trusting state-2/3 detail.</w:t>
+      </w:r>
+    </w:p>
+    <w:p>
+      <w:pPr>
+        <w:pStyle w:val="BlockText"/>
+      </w:pPr>
+      <w:r>
+        <w:t xml:space="preserve">When this body disagrees with the above,</w:t>
+      </w:r>
+      <w:r>
+        <w:t xml:space="preserve"> </w:t>
+      </w:r>
+      <w:r>
+        <w:rPr>
+          <w:b/>
+          <w:bCs/>
+        </w:rPr>
+        <w:t xml:space="preserve">the above wins.</w:t>
       </w:r>
     </w:p>
     <w:p>
@@ -98,7 +380,7 @@
         </w:pict>
       </w:r>
     </w:p>
-    <w:bookmarkStart w:id="24" w:name="X569d15f64735de45c6710431c7af4cd77f4132e"/>
+    <w:bookmarkStart w:id="25" w:name="X569d15f64735de45c6710431c7af4cd77f4132e"/>
     <w:p>
       <w:pPr>
         <w:pStyle w:val="Heading2"/>
@@ -183,7 +465,7 @@
         <w:t xml:space="preserve">so callers in 0006 / 0012 / 0017 / 0031 / 0046 don’t have to chase 4-vs-3 ambiguity per consumer.</w:t>
       </w:r>
     </w:p>
-    <w:bookmarkStart w:id="10" w:name="X7989c98113e1ee2866a01ff4cc776ba33887597"/>
+    <w:bookmarkStart w:id="11" w:name="X7989c98113e1ee2866a01ff4cc776ba33887597"/>
     <w:p>
       <w:pPr>
         <w:pStyle w:val="Heading3"/>
@@ -528,7 +810,7 @@
       <w:r>
         <w:t xml:space="preserve"> </w:t>
       </w:r>
-      <w:hyperlink r:id="rId9">
+      <w:hyperlink r:id="rId10">
         <w:r>
           <w:rPr>
             <w:rStyle w:val="Hyperlink"/>
@@ -558,8 +840,8 @@
         <w:t xml:space="preserve">(existing column · NULL = auto-compute).</w:t>
       </w:r>
     </w:p>
-    <w:bookmarkEnd w:id="10"/>
-    <w:bookmarkStart w:id="11" w:name="four-qr-uses-four-token-bearing-actors"/>
+    <w:bookmarkEnd w:id="11"/>
+    <w:bookmarkStart w:id="12" w:name="four-qr-uses-four-token-bearing-actors"/>
     <w:p>
       <w:pPr>
         <w:pStyle w:val="Heading3"/>
@@ -877,8 +1159,8 @@
         <w:t xml:space="preserve">— minted only at seating-chart publish per 0008’s 2026-05-09 lock) is a DISTINCT token from the guest QR. The table QR fans tags to every guest seated at that table (capped at 10 per photo); the guest QR tags exactly one person. Both are first-class scan vectors in 0012 § Tagging; they don’t compete or overlap.</w:t>
       </w:r>
     </w:p>
-    <w:bookmarkEnd w:id="11"/>
-    <w:bookmarkStart w:id="13" w:name="X4ca8218896649aa08ce657a081b6ad112f6a329"/>
+    <w:bookmarkEnd w:id="12"/>
+    <w:bookmarkStart w:id="14" w:name="X4ca8218896649aa08ce657a081b6ad112f6a329"/>
     <w:p>
       <w:pPr>
         <w:pStyle w:val="Heading3"/>
@@ -936,7 +1218,7 @@
       <w:r>
         <w:t xml:space="preserve"> </w:t>
       </w:r>
-      <w:hyperlink r:id="rId12">
+      <w:hyperlink r:id="rId13">
         <w:r>
           <w:rPr>
             <w:rStyle w:val="Hyperlink"/>
@@ -1357,8 +1639,8 @@
         <w:t xml:space="preserve">JSON field on the row for analytics (claims via scan show ~85% verified-coverage match versus ~60% for dashboard claims — useful signal for the 4-layer moderation pipeline’s auto-approval heuristics).</w:t>
       </w:r>
     </w:p>
-    <w:bookmarkEnd w:id="13"/>
-    <w:bookmarkStart w:id="21" w:name="cross-iteration-map"/>
+    <w:bookmarkEnd w:id="14"/>
+    <w:bookmarkStart w:id="22" w:name="cross-iteration-map"/>
     <w:p>
       <w:pPr>
         <w:pStyle w:val="Heading3"/>
@@ -1412,7 +1694,7 @@
             <w:pPr>
               <w:pStyle w:val="Compact"/>
             </w:pPr>
-            <w:hyperlink r:id="rId14">
+            <w:hyperlink r:id="rId15">
               <w:r>
                 <w:rPr>
                   <w:rStyle w:val="Hyperlink"/>
@@ -1467,7 +1749,7 @@
             <w:pPr>
               <w:pStyle w:val="Compact"/>
             </w:pPr>
-            <w:hyperlink r:id="rId15">
+            <w:hyperlink r:id="rId16">
               <w:r>
                 <w:rPr>
                   <w:rStyle w:val="Hyperlink"/>
@@ -1513,7 +1795,7 @@
             <w:pPr>
               <w:pStyle w:val="Compact"/>
             </w:pPr>
-            <w:hyperlink r:id="rId16">
+            <w:hyperlink r:id="rId17">
               <w:r>
                 <w:rPr>
                   <w:rStyle w:val="Hyperlink"/>
@@ -1574,7 +1856,7 @@
             <w:pPr>
               <w:pStyle w:val="Compact"/>
             </w:pPr>
-            <w:hyperlink r:id="rId17">
+            <w:hyperlink r:id="rId18">
               <w:r>
                 <w:rPr>
                   <w:rStyle w:val="Hyperlink"/>
@@ -1620,7 +1902,7 @@
             <w:pPr>
               <w:pStyle w:val="Compact"/>
             </w:pPr>
-            <w:hyperlink r:id="rId18">
+            <w:hyperlink r:id="rId19">
               <w:r>
                 <w:rPr>
                   <w:rStyle w:val="Hyperlink"/>
@@ -1651,7 +1933,7 @@
             <w:pPr>
               <w:pStyle w:val="Compact"/>
             </w:pPr>
-            <w:hyperlink r:id="rId19">
+            <w:hyperlink r:id="rId20">
               <w:r>
                 <w:rPr>
                   <w:rStyle w:val="Hyperlink"/>
@@ -1682,7 +1964,7 @@
             <w:pPr>
               <w:pStyle w:val="Compact"/>
             </w:pPr>
-            <w:hyperlink r:id="rId9">
+            <w:hyperlink r:id="rId10">
               <w:r>
                 <w:rPr>
                   <w:rStyle w:val="Hyperlink"/>
@@ -1725,7 +2007,7 @@
             <w:pPr>
               <w:pStyle w:val="Compact"/>
             </w:pPr>
-            <w:hyperlink r:id="rId20">
+            <w:hyperlink r:id="rId21">
               <w:r>
                 <w:rPr>
                   <w:rStyle w:val="Hyperlink"/>
@@ -1756,7 +2038,7 @@
             <w:pPr>
               <w:pStyle w:val="Compact"/>
             </w:pPr>
-            <w:hyperlink r:id="rId12">
+            <w:hyperlink r:id="rId13">
               <w:r>
                 <w:rPr>
                   <w:rStyle w:val="Hyperlink"/>
@@ -1872,8 +2154,8 @@
         </w:tc>
       </w:tr>
     </w:tbl>
-    <w:bookmarkEnd w:id="21"/>
-    <w:bookmarkStart w:id="22" w:name="two-architectural-calls-ratified-on-lock"/>
+    <w:bookmarkEnd w:id="22"/>
+    <w:bookmarkStart w:id="23" w:name="two-architectural-calls-ratified-on-lock"/>
     <w:p>
       <w:pPr>
         <w:pStyle w:val="Heading3"/>
@@ -1980,8 +2262,8 @@
         <w:t xml:space="preserve">param hydrate the guest’s overlay on top.</w:t>
       </w:r>
     </w:p>
-    <w:bookmarkEnd w:id="22"/>
-    <w:bookmarkStart w:id="23" w:name="what-this-lock-does-not-change"/>
+    <w:bookmarkEnd w:id="23"/>
+    <w:bookmarkStart w:id="24" w:name="what-this-lock-does-not-change"/>
     <w:p>
       <w:pPr>
         <w:pStyle w:val="Heading3"/>
@@ -2343,9 +2625,9 @@
         </w:pict>
       </w:r>
     </w:p>
-    <w:bookmarkEnd w:id="23"/>
     <w:bookmarkEnd w:id="24"/>
-    <w:bookmarkStart w:id="25" w:name="what-to-build"/>
+    <w:bookmarkEnd w:id="25"/>
+    <w:bookmarkStart w:id="26" w:name="what-to-build"/>
     <w:p>
       <w:pPr>
         <w:pStyle w:val="Heading2"/>
@@ -2556,8 +2838,8 @@
         </w:pict>
       </w:r>
     </w:p>
-    <w:bookmarkEnd w:id="25"/>
-    <w:bookmarkStart w:id="31" w:name="X21ad6ca7fb5352b38c30d4a687b454703d517fa"/>
+    <w:bookmarkEnd w:id="26"/>
+    <w:bookmarkStart w:id="32" w:name="X21ad6ca7fb5352b38c30d4a687b454703d517fa"/>
     <w:p>
       <w:pPr>
         <w:pStyle w:val="Heading2"/>
@@ -2623,7 +2905,7 @@
         <w:t xml:space="preserve">The original 0024 § 5a already imagined the landing page as one lifecycle-phased surface. The reframe (decision log 2026-05-16) drops the MP4-rendering primitive entirely and makes Phase 1 a first-class layout that runs on web tech only (animated SVG monogram + countdown + calendar-add + Open Graph card + music). No FFmpeg pipeline, no render storage, no aspect-ratio multiplexing. The lifecycle machinery belongs to the landing-page chassis, which lives in this iteration.</w:t>
       </w:r>
     </w:p>
-    <w:bookmarkStart w:id="26" w:name="the-four-phases"/>
+    <w:bookmarkStart w:id="27" w:name="the-four-phases"/>
     <w:p>
       <w:pPr>
         <w:pStyle w:val="Heading3"/>
@@ -2851,8 +3133,8 @@
         <w:t xml:space="preserve">- 30-day photo download window already documented elsewhere in this spec</w:t>
       </w:r>
     </w:p>
-    <w:bookmarkEnd w:id="26"/>
-    <w:bookmarkStart w:id="27" w:name="auto-transition-mechanics"/>
+    <w:bookmarkEnd w:id="27"/>
+    <w:bookmarkStart w:id="28" w:name="auto-transition-mechanics"/>
     <w:p>
       <w:pPr>
         <w:pStyle w:val="Heading3"/>
@@ -3227,8 +3509,8 @@
         <w:t xml:space="preserve">Auto-transitions happen on first request after the boundary. Couples can manually override any phase from the landing-page editor (in 0004’s couple-side customize surface). The override flag is per-phase; a couple can stay on the Save-the-Date hero forever if they want.</w:t>
       </w:r>
     </w:p>
-    <w:bookmarkEnd w:id="27"/>
-    <w:bookmarkStart w:id="28" w:name="schema-addition"/>
+    <w:bookmarkEnd w:id="28"/>
+    <w:bookmarkStart w:id="29" w:name="schema-addition"/>
     <w:p>
       <w:pPr>
         <w:pStyle w:val="Heading3"/>
@@ -3440,8 +3722,8 @@
         <w:t xml:space="preserve">-- non-NULL = couple has pinned this phase, ignore date math</w:t>
       </w:r>
     </w:p>
-    <w:bookmarkEnd w:id="28"/>
-    <w:bookmarkStart w:id="29" w:name="why-default-on-no-opt-in"/>
+    <w:bookmarkEnd w:id="29"/>
+    <w:bookmarkStart w:id="30" w:name="why-default-on-no-opt-in"/>
     <w:p>
       <w:pPr>
         <w:pStyle w:val="Heading3"/>
@@ -3458,8 +3740,8 @@
         <w:t xml:space="preserve">The first 6–8 months of a landing page’s life is announcement traffic. Defaulting Phase 1 as the hero matches what those visitors came expecting — the polished Save-the-Date moment from the couple’s social share. Forcing opt-in means most couples never set up Phase 1 and the landing page launches with an empty or generic hero. Couples who want a different starting state use the per-phase override.</w:t>
       </w:r>
     </w:p>
-    <w:bookmarkEnd w:id="29"/>
-    <w:bookmarkStart w:id="30" w:name="pricing"/>
+    <w:bookmarkEnd w:id="30"/>
+    <w:bookmarkStart w:id="31" w:name="pricing"/>
     <w:p>
       <w:pPr>
         <w:pStyle w:val="Heading3"/>
@@ -3563,9 +3845,9 @@
         </w:pict>
       </w:r>
     </w:p>
-    <w:bookmarkEnd w:id="30"/>
     <w:bookmarkEnd w:id="31"/>
-    <w:bookmarkStart w:id="32" w:name="visual-reference-canonical"/>
+    <w:bookmarkEnd w:id="32"/>
+    <w:bookmarkStart w:id="33" w:name="visual-reference-canonical"/>
     <w:p>
       <w:pPr>
         <w:pStyle w:val="Heading2"/>
@@ -3650,8 +3932,8 @@
         </w:pict>
       </w:r>
     </w:p>
-    <w:bookmarkEnd w:id="32"/>
-    <w:bookmarkStart w:id="33" w:name="stack-conventions"/>
+    <w:bookmarkEnd w:id="33"/>
+    <w:bookmarkStart w:id="34" w:name="stack-conventions"/>
     <w:p>
       <w:pPr>
         <w:pStyle w:val="Heading2"/>
@@ -4101,8 +4383,8 @@
         </w:pict>
       </w:r>
     </w:p>
-    <w:bookmarkEnd w:id="33"/>
-    <w:bookmarkStart w:id="38" w:name="token-format-and-uri-scheme"/>
+    <w:bookmarkEnd w:id="34"/>
+    <w:bookmarkStart w:id="39" w:name="token-format-and-uri-scheme"/>
     <w:p>
       <w:pPr>
         <w:pStyle w:val="Heading2"/>
@@ -4111,7 +4393,7 @@
         <w:t xml:space="preserve">Token format and URI scheme</w:t>
       </w:r>
     </w:p>
-    <w:bookmarkStart w:id="34" w:name="token"/>
+    <w:bookmarkStart w:id="35" w:name="token"/>
     <w:p>
       <w:pPr>
         <w:pStyle w:val="Heading3"/>
@@ -4199,8 +4481,8 @@
         <w:t xml:space="preserve">values. The two QRs print on two separate cards, scan to two different personal invitation sites, and tag separately for paparazzi photos. Sharing a single QR between a primary and a +1 is not supported and would break tagging, RSVP, and the per-guest scan history.</w:t>
       </w:r>
     </w:p>
-    <w:bookmarkEnd w:id="34"/>
-    <w:bookmarkStart w:id="35" w:name="uri-scheme-unified-across-surfaces"/>
+    <w:bookmarkEnd w:id="35"/>
+    <w:bookmarkStart w:id="36" w:name="uri-scheme-unified-across-surfaces"/>
     <w:p>
       <w:pPr>
         <w:pStyle w:val="Heading3"/>
@@ -4303,8 +4585,8 @@
         <w:t xml:space="preserve">is implemented end-to-end on the web side; the others are reserved for future iterations (Din work).</w:t>
       </w:r>
     </w:p>
-    <w:bookmarkEnd w:id="35"/>
-    <w:bookmarkStart w:id="36" w:name="browser-fallback-url"/>
+    <w:bookmarkEnd w:id="36"/>
+    <w:bookmarkStart w:id="37" w:name="browser-fallback-url"/>
     <w:p>
       <w:pPr>
         <w:pStyle w:val="Heading3"/>
@@ -4393,8 +4675,8 @@
         <w:t xml:space="preserve">If the user wants to manually trigger native-app scanning (e.g., they’re already in Sulyap mode), the apps can also scan and parse the URL, decoding the token + entity from the path.</w:t>
       </w:r>
     </w:p>
-    <w:bookmarkEnd w:id="36"/>
-    <w:bookmarkStart w:id="37" w:name="X61dc0d19478733601fb8ad9b64847106fa04d34"/>
+    <w:bookmarkEnd w:id="37"/>
+    <w:bookmarkStart w:id="38" w:name="X61dc0d19478733601fb8ad9b64847106fa04d34"/>
     <w:p>
       <w:pPr>
         <w:pStyle w:val="Heading3"/>
@@ -4486,9 +4768,9 @@
         </w:pict>
       </w:r>
     </w:p>
-    <w:bookmarkEnd w:id="37"/>
     <w:bookmarkEnd w:id="38"/>
-    <w:bookmarkStart w:id="45" w:name="personal-invitation-site"/>
+    <w:bookmarkEnd w:id="39"/>
+    <w:bookmarkStart w:id="46" w:name="personal-invitation-site"/>
     <w:p>
       <w:pPr>
         <w:pStyle w:val="Heading2"/>
@@ -4497,7 +4779,7 @@
         <w:t xml:space="preserve">Personal invitation site</w:t>
       </w:r>
     </w:p>
-    <w:bookmarkStart w:id="39" w:name="route"/>
+    <w:bookmarkStart w:id="40" w:name="route"/>
     <w:p>
       <w:pPr>
         <w:pStyle w:val="Heading3"/>
@@ -4767,8 +5049,8 @@
         <w:t xml:space="preserve">Server-render the personalized page using the cookie session for guest identity.</w:t>
       </w:r>
     </w:p>
-    <w:bookmarkEnd w:id="39"/>
-    <w:bookmarkStart w:id="40" w:name="X79db0844f2b93d4851af2e1e40a1b4badc6b1c2"/>
+    <w:bookmarkEnd w:id="40"/>
+    <w:bookmarkStart w:id="41" w:name="X79db0844f2b93d4851af2e1e40a1b4badc6b1c2"/>
     <w:p>
       <w:pPr>
         <w:pStyle w:val="Heading3"/>
@@ -5658,8 +5940,8 @@
         <w:t xml:space="preserve">below) instead of the full one.</w:t>
       </w:r>
     </w:p>
-    <w:bookmarkEnd w:id="40"/>
-    <w:bookmarkStart w:id="41" w:name="page-composition-desktop"/>
+    <w:bookmarkEnd w:id="41"/>
+    <w:bookmarkStart w:id="42" w:name="page-composition-desktop"/>
     <w:p>
       <w:pPr>
         <w:pStyle w:val="Heading3"/>
@@ -6556,8 +6838,8 @@
         <w:t xml:space="preserve">.</w:t>
       </w:r>
     </w:p>
-    <w:bookmarkEnd w:id="41"/>
-    <w:bookmarkStart w:id="42" w:name="page-composition-mobile"/>
+    <w:bookmarkEnd w:id="42"/>
+    <w:bookmarkStart w:id="43" w:name="page-composition-mobile"/>
     <w:p>
       <w:pPr>
         <w:pStyle w:val="Heading3"/>
@@ -6769,8 +7051,8 @@
         <w:t xml:space="preserve">.</w:t>
       </w:r>
     </w:p>
-    <w:bookmarkEnd w:id="42"/>
-    <w:bookmarkStart w:id="43" w:name="what-the-guest-can-do"/>
+    <w:bookmarkEnd w:id="43"/>
+    <w:bookmarkStart w:id="44" w:name="what-the-guest-can-do"/>
     <w:p>
       <w:pPr>
         <w:pStyle w:val="Heading3"/>
@@ -6863,8 +7145,8 @@
         <w:t xml:space="preserve">Pre-event: see the empty-state for their photos. Post-event: see their tagged photos + reel builder (when those features ship).</w:t>
       </w:r>
     </w:p>
-    <w:bookmarkEnd w:id="43"/>
-    <w:bookmarkStart w:id="44" w:name="limited-1-invitation-site-locked-variant"/>
+    <w:bookmarkEnd w:id="44"/>
+    <w:bookmarkStart w:id="45" w:name="limited-1-invitation-site-locked-variant"/>
     <w:p>
       <w:pPr>
         <w:pStyle w:val="Heading3"/>
@@ -7990,9 +8272,9 @@
         </w:pict>
       </w:r>
     </w:p>
-    <w:bookmarkEnd w:id="44"/>
     <w:bookmarkEnd w:id="45"/>
-    <w:bookmarkStart w:id="50" w:name="couples-qr-admin-view"/>
+    <w:bookmarkEnd w:id="46"/>
+    <w:bookmarkStart w:id="51" w:name="couples-qr-admin-view"/>
     <w:p>
       <w:pPr>
         <w:pStyle w:val="Heading2"/>
@@ -8001,7 +8283,7 @@
         <w:t xml:space="preserve">Couple’s QR admin view</w:t>
       </w:r>
     </w:p>
-    <w:bookmarkStart w:id="46" w:name="route-1"/>
+    <w:bookmarkStart w:id="47" w:name="route-1"/>
     <w:p>
       <w:pPr>
         <w:pStyle w:val="Heading3"/>
@@ -8021,8 +8303,8 @@
         <w:t xml:space="preserve">setnayan.com/dashboard/qr-codes</w:t>
       </w:r>
     </w:p>
-    <w:bookmarkEnd w:id="46"/>
-    <w:bookmarkStart w:id="47" w:name="page-composition-desktop-1"/>
+    <w:bookmarkEnd w:id="47"/>
+    <w:bookmarkStart w:id="48" w:name="page-composition-desktop-1"/>
     <w:p>
       <w:pPr>
         <w:pStyle w:val="Heading3"/>
@@ -8364,8 +8646,8 @@
         <w:t xml:space="preserve">A coverage legend renders above the table explaining the dot/chip meanings (P / C / Co / R for segments; ✓ for has photo; ✓ + corner mark for has photo + clip).</w:t>
       </w:r>
     </w:p>
-    <w:bookmarkEnd w:id="47"/>
-    <w:bookmarkStart w:id="48" w:name="mobile-composition"/>
+    <w:bookmarkEnd w:id="48"/>
+    <w:bookmarkStart w:id="49" w:name="mobile-composition"/>
     <w:p>
       <w:pPr>
         <w:pStyle w:val="Heading3"/>
@@ -8477,8 +8759,8 @@
         <w:t xml:space="preserve">Tapping a guest row opens a full-screen detail sheet with the full coverage breakdown per segment and per vendor.</w:t>
       </w:r>
     </w:p>
-    <w:bookmarkEnd w:id="48"/>
-    <w:bookmarkStart w:id="49" w:name="print-sheet-format"/>
+    <w:bookmarkEnd w:id="49"/>
+    <w:bookmarkStart w:id="50" w:name="print-sheet-format"/>
     <w:p>
       <w:pPr>
         <w:pStyle w:val="Heading3"/>
@@ -8565,9 +8847,9 @@
         </w:pict>
       </w:r>
     </w:p>
-    <w:bookmarkEnd w:id="49"/>
     <w:bookmarkEnd w:id="50"/>
-    <w:bookmarkStart w:id="57" w:name="database-schema-additions"/>
+    <w:bookmarkEnd w:id="51"/>
+    <w:bookmarkStart w:id="58" w:name="database-schema-additions"/>
     <w:p>
       <w:pPr>
         <w:pStyle w:val="Heading2"/>
@@ -8576,7 +8858,7 @@
         <w:t xml:space="preserve">Database schema additions</w:t>
       </w:r>
     </w:p>
-    <w:bookmarkStart w:id="51" w:name="Xfda80656d44ffb2d8b22ff25ca209cf3d4044e4"/>
+    <w:bookmarkStart w:id="52" w:name="Xfda80656d44ffb2d8b22ff25ca209cf3d4044e4"/>
     <w:p>
       <w:pPr>
         <w:pStyle w:val="Heading3"/>
@@ -9312,8 +9594,8 @@
         <w:t xml:space="preserve">is the line item that was claimed).</w:t>
       </w:r>
     </w:p>
-    <w:bookmarkEnd w:id="51"/>
-    <w:bookmarkStart w:id="52" w:name="X5955d6d06cdbab03745ef9910800b31490ff4b8"/>
+    <w:bookmarkEnd w:id="52"/>
+    <w:bookmarkStart w:id="53" w:name="X5955d6d06cdbab03745ef9910800b31490ff4b8"/>
     <w:p>
       <w:pPr>
         <w:pStyle w:val="Heading3"/>
@@ -11881,8 +12163,8 @@
         <w:t xml:space="preserve">as a prop.</w:t>
       </w:r>
     </w:p>
-    <w:bookmarkEnd w:id="52"/>
-    <w:bookmarkStart w:id="53" w:name="Xbad737997d7ee94759131be773b29dbb05c4012"/>
+    <w:bookmarkEnd w:id="53"/>
+    <w:bookmarkStart w:id="54" w:name="Xbad737997d7ee94759131be773b29dbb05c4012"/>
     <w:p>
       <w:pPr>
         <w:pStyle w:val="Heading3"/>
@@ -12019,8 +12301,8 @@
         <w:t xml:space="preserve">The frame stroke inherits the wedding’s accent color from the locked palette by default. If the couple picked Custom QR colors (per the QR Code Widget settings), the frame stroke can be independently overridden — but the simplified variant at QR center always renders cleanly against the QR’s pattern color.</w:t>
       </w:r>
     </w:p>
-    <w:bookmarkEnd w:id="53"/>
-    <w:bookmarkStart w:id="54" w:name="Xd7cc3636f25129950ac8b541fd249d47d4d49c1"/>
+    <w:bookmarkEnd w:id="54"/>
+    <w:bookmarkStart w:id="55" w:name="Xd7cc3636f25129950ac8b541fd249d47d4d49c1"/>
     <w:p>
       <w:pPr>
         <w:pStyle w:val="Heading3"/>
@@ -12720,8 +13002,8 @@
         <w:t xml:space="preserve">This means a couple who’s already worked with a wedding-branding designer can use that monogram everywhere Setnayan shows their identity — hero, QR center, print sheet, OG image — without redoing the design through Setnayan’s auto-generator.</w:t>
       </w:r>
     </w:p>
-    <w:bookmarkEnd w:id="54"/>
-    <w:bookmarkStart w:id="55" w:name="Xf754d628dc3537e01bf1d5727589b3518970454"/>
+    <w:bookmarkEnd w:id="55"/>
+    <w:bookmarkStart w:id="56" w:name="Xf754d628dc3537e01bf1d5727589b3518970454"/>
     <w:p>
       <w:pPr>
         <w:pStyle w:val="Heading3"/>
@@ -12978,8 +13260,8 @@
         <w:t xml:space="preserve">if set, the placeholder if not.</w:t>
       </w:r>
     </w:p>
-    <w:bookmarkEnd w:id="55"/>
-    <w:bookmarkStart w:id="56" w:name="X123b7f60014db0bedf15d9353076ff0b59f4ed9"/>
+    <w:bookmarkEnd w:id="56"/>
+    <w:bookmarkStart w:id="57" w:name="X123b7f60014db0bedf15d9353076ff0b59f4ed9"/>
     <w:p>
       <w:pPr>
         <w:pStyle w:val="Heading3"/>
@@ -13036,9 +13318,9 @@
         </w:pict>
       </w:r>
     </w:p>
-    <w:bookmarkEnd w:id="56"/>
     <w:bookmarkEnd w:id="57"/>
-    <w:bookmarkStart w:id="61" w:name="Xa0ee14b6b45b52049027f5edc7b7d1ba53ba33a"/>
+    <w:bookmarkEnd w:id="58"/>
+    <w:bookmarkStart w:id="62" w:name="Xa0ee14b6b45b52049027f5edc7b7d1ba53ba33a"/>
     <w:p>
       <w:pPr>
         <w:pStyle w:val="Heading2"/>
@@ -13071,7 +13353,7 @@
         <w:t xml:space="preserve">is implemented. The other two are stubbed.</w:t>
       </w:r>
     </w:p>
-    <w:bookmarkStart w:id="58" w:name="browser-implemented"/>
+    <w:bookmarkStart w:id="59" w:name="browser-implemented"/>
     <w:p>
       <w:pPr>
         <w:pStyle w:val="Heading3"/>
@@ -13088,8 +13370,8 @@
         <w:t xml:space="preserve">Already specified above: token validates → magic-link cookie → personal invitation site.</w:t>
       </w:r>
     </w:p>
-    <w:bookmarkEnd w:id="58"/>
-    <w:bookmarkStart w:id="59" w:name="setnayan-native-phase-2-stub-only"/>
+    <w:bookmarkEnd w:id="59"/>
+    <w:bookmarkStart w:id="60" w:name="setnayan-native-phase-2-stub-only"/>
     <w:p>
       <w:pPr>
         <w:pStyle w:val="Heading3"/>
@@ -13324,8 +13606,8 @@
         <w:t xml:space="preserve">UI)</w:t>
       </w:r>
     </w:p>
-    <w:bookmarkEnd w:id="59"/>
-    <w:bookmarkStart w:id="60" w:name="din-phase-3-stub-only"/>
+    <w:bookmarkEnd w:id="60"/>
+    <w:bookmarkStart w:id="61" w:name="din-phase-3-stub-only"/>
     <w:p>
       <w:pPr>
         <w:pStyle w:val="Heading3"/>
@@ -13447,9 +13729,9 @@
         </w:pict>
       </w:r>
     </w:p>
-    <w:bookmarkEnd w:id="60"/>
     <w:bookmarkEnd w:id="61"/>
-    <w:bookmarkStart w:id="78" w:name="functional-scope"/>
+    <w:bookmarkEnd w:id="62"/>
+    <w:bookmarkStart w:id="79" w:name="functional-scope"/>
     <w:p>
       <w:pPr>
         <w:pStyle w:val="Heading2"/>
@@ -13458,7 +13740,7 @@
         <w:t xml:space="preserve">Functional scope</w:t>
       </w:r>
     </w:p>
-    <w:bookmarkStart w:id="62" w:name="must-work-end-to-end-this-iteration"/>
+    <w:bookmarkStart w:id="63" w:name="must-work-end-to-end-this-iteration"/>
     <w:p>
       <w:pPr>
         <w:pStyle w:val="Heading3"/>
@@ -13819,8 +14101,8 @@
         <w:t xml:space="preserve">).</w:t>
       </w:r>
     </w:p>
-    <w:bookmarkEnd w:id="62"/>
-    <w:bookmarkStart w:id="68" w:name="X60b58f115477fdc864e01eee4d0eb04274891a0"/>
+    <w:bookmarkEnd w:id="63"/>
+    <w:bookmarkStart w:id="69" w:name="X60b58f115477fdc864e01eee4d0eb04274891a0"/>
     <w:p>
       <w:pPr>
         <w:pStyle w:val="Heading3"/>
@@ -13869,7 +14151,7 @@
         <w:t xml:space="preserve">that couples can shape via the downstream editor as long as they stay within scan-safe boundaries.</w:t>
       </w:r>
     </w:p>
-    <w:bookmarkStart w:id="63" w:name="X78fddaf4e9f33326b300299cf8e55c2fc70c922"/>
+    <w:bookmarkStart w:id="64" w:name="X78fddaf4e9f33326b300299cf8e55c2fc70c922"/>
     <w:p>
       <w:pPr>
         <w:pStyle w:val="Heading4"/>
@@ -14266,8 +14548,8 @@
         </w:tc>
       </w:tr>
     </w:tbl>
-    <w:bookmarkEnd w:id="63"/>
-    <w:bookmarkStart w:id="64" w:name="X4672b4a73ae5fb14f45fc9dc7fbd4fdf005cee9"/>
+    <w:bookmarkEnd w:id="64"/>
+    <w:bookmarkStart w:id="65" w:name="X4672b4a73ae5fb14f45fc9dc7fbd4fdf005cee9"/>
     <w:p>
       <w:pPr>
         <w:pStyle w:val="Heading4"/>
@@ -14948,8 +15230,8 @@
         <w:t xml:space="preserve">The renderer picks the role palette, then derives QR colors using the existing rule (darkest swatch with ≥7:1 contrast as pattern, lightest as background, fallback to ≥4:1).</w:t>
       </w:r>
     </w:p>
-    <w:bookmarkEnd w:id="64"/>
-    <w:bookmarkStart w:id="65" w:name="Xde7194576809f37b3836f27d191d035703459b7"/>
+    <w:bookmarkEnd w:id="65"/>
+    <w:bookmarkStart w:id="66" w:name="Xde7194576809f37b3836f27d191d035703459b7"/>
     <w:p>
       <w:pPr>
         <w:pStyle w:val="Heading4"/>
@@ -15086,8 +15368,8 @@
         <w:t xml:space="preserve">The recommended palette stays visually tied to the role (uses the role’s primary hue) without violating scan reliability. Couples don’t see this happen — it’s silent renderer behavior. If they want to override, they can set custom QR colors via the QR Code Widget like always.</w:t>
       </w:r>
     </w:p>
-    <w:bookmarkEnd w:id="65"/>
-    <w:bookmarkStart w:id="66" w:name="X968b8395944234308626196fc026123547b6fa6"/>
+    <w:bookmarkEnd w:id="66"/>
+    <w:bookmarkStart w:id="67" w:name="X968b8395944234308626196fc026123547b6fa6"/>
     <w:p>
       <w:pPr>
         <w:pStyle w:val="Heading4"/>
@@ -15710,8 +15992,8 @@
         <w:t xml:space="preserve">Couples who don’t think about QR styling get an on-brand QR — but only after they’ve committed to a palette. Until then, the safe default protects them from flickering QR appearances during planning.</w:t>
       </w:r>
     </w:p>
-    <w:bookmarkEnd w:id="66"/>
-    <w:bookmarkStart w:id="67" w:name="X438bf3fa7b3b2e5deab1ce7eb7c26e9ab91c389"/>
+    <w:bookmarkEnd w:id="67"/>
+    <w:bookmarkStart w:id="68" w:name="X438bf3fa7b3b2e5deab1ce7eb7c26e9ab91c389"/>
     <w:p>
       <w:pPr>
         <w:pStyle w:val="Heading4"/>
@@ -16736,9 +17018,9 @@
         <w:t xml:space="preserve">is customizable — couples can match it to their wedding’s color palette as long as the contrast stays scan-friendly. The editor runs validation in real-time so couples never end up with an unscannable QR no matter what they configure. This is the same pattern Spotify codes, Apple Wallet passes, and branded marketing QRs at scale use: locked structure, customizable surface.</w:t>
       </w:r>
     </w:p>
-    <w:bookmarkEnd w:id="67"/>
     <w:bookmarkEnd w:id="68"/>
-    <w:bookmarkStart w:id="69" w:name="Xac051fca860295031beb052115ddaaff903badd"/>
+    <w:bookmarkEnd w:id="69"/>
+    <w:bookmarkStart w:id="70" w:name="Xac051fca860295031beb052115ddaaff903badd"/>
     <w:p>
       <w:pPr>
         <w:pStyle w:val="Heading3"/>
@@ -17170,8 +17452,8 @@
         <w:t xml:space="preserve">so the admin coverage view can highlight first-rule scans separately from regular tagging.</w:t>
       </w:r>
     </w:p>
-    <w:bookmarkEnd w:id="69"/>
-    <w:bookmarkStart w:id="70" w:name="X5c6e81f9ca0501afd7f82a80d8e81c28050939d"/>
+    <w:bookmarkEnd w:id="70"/>
+    <w:bookmarkStart w:id="71" w:name="X5c6e81f9ca0501afd7f82a80d8e81c28050939d"/>
     <w:p>
       <w:pPr>
         <w:pStyle w:val="Heading3"/>
@@ -17455,8 +17737,8 @@
         <w:t xml:space="preserve">The QR token therefore plays two roles: as a magic-link bearer for browser sessions, and as an auto-login credential for native-app sessions. Both end together. Either trigger above ends them. Nothing else.</w:t>
       </w:r>
     </w:p>
-    <w:bookmarkEnd w:id="70"/>
-    <w:bookmarkStart w:id="71" w:name="X9919f24d3b5e40f111d331b5a0bf15b98e8d8e0"/>
+    <w:bookmarkEnd w:id="71"/>
+    <w:bookmarkStart w:id="72" w:name="X9919f24d3b5e40f111d331b5a0bf15b98e8d8e0"/>
     <w:p>
       <w:pPr>
         <w:pStyle w:val="Heading3"/>
@@ -17896,8 +18178,8 @@
         <w:t xml:space="preserve">only if the session is account-authenticated; otherwise the locked-state UI shows.</w:t>
       </w:r>
     </w:p>
-    <w:bookmarkEnd w:id="71"/>
-    <w:bookmarkStart w:id="72" w:name="X75883b72fa4f64ef9af3cd032900ea4af719fa9"/>
+    <w:bookmarkEnd w:id="72"/>
+    <w:bookmarkStart w:id="73" w:name="X75883b72fa4f64ef9af3cd032900ea4af719fa9"/>
     <w:p>
       <w:pPr>
         <w:pStyle w:val="Heading3"/>
@@ -18051,8 +18333,8 @@
         <w:t xml:space="preserve">(TIMESTAMPTZ, nullable) tracks when the guest first triggered a successful zip download. Used to suppress the post-download screen on subsequent visits unless they download again.</w:t>
       </w:r>
     </w:p>
-    <w:bookmarkEnd w:id="72"/>
-    <w:bookmarkStart w:id="73" w:name="X5e26198e11c04b110d7a3231b75698daeb3c7de"/>
+    <w:bookmarkEnd w:id="73"/>
+    <w:bookmarkStart w:id="74" w:name="X5e26198e11c04b110d7a3231b75698daeb3c7de"/>
     <w:p>
       <w:pPr>
         <w:pStyle w:val="Heading3"/>
@@ -18336,8 +18618,8 @@
         <w:t xml:space="preserve">settings panel and the post-release notification.</w:t>
       </w:r>
     </w:p>
-    <w:bookmarkEnd w:id="73"/>
-    <w:bookmarkStart w:id="74" w:name="Xef64f50735275fb48847aea55e394ecc8969f23"/>
+    <w:bookmarkEnd w:id="74"/>
+    <w:bookmarkStart w:id="75" w:name="Xef64f50735275fb48847aea55e394ecc8969f23"/>
     <w:p>
       <w:pPr>
         <w:pStyle w:val="Heading3"/>
@@ -18495,8 +18777,8 @@
         <w:t xml:space="preserve">These rules go into spec 10 (Papic Feature Specification) when CLAUDE.md gets its next pass; for now they live here as the canonical reference.</w:t>
       </w:r>
     </w:p>
-    <w:bookmarkEnd w:id="74"/>
-    <w:bookmarkStart w:id="75" w:name="X33f76ba2be5e56583d382c62d9c90258ee87a6c"/>
+    <w:bookmarkEnd w:id="75"/>
+    <w:bookmarkStart w:id="76" w:name="X33f76ba2be5e56583d382c62d9c90258ee87a6c"/>
     <w:p>
       <w:pPr>
         <w:pStyle w:val="Heading3"/>
@@ -19190,8 +19472,8 @@
         <w:t xml:space="preserve">No paid tier is required to unlock Shutter, Selfie Camera, Photo Challenges, or Saved Photos. The acquisition motion is: get every wedding guest to register a Setnayan account. Revenue comes from the couple’s tier (Essentials / Premium / Pro Event) and per-event Pro widget upgrades, not from charging guests.</w:t>
       </w:r>
     </w:p>
-    <w:bookmarkEnd w:id="75"/>
-    <w:bookmarkStart w:id="76" w:name="in-app-features-phase-2-phase-2.5"/>
+    <w:bookmarkEnd w:id="76"/>
+    <w:bookmarkStart w:id="77" w:name="in-app-features-phase-2-phase-2.5"/>
     <w:p>
       <w:pPr>
         <w:pStyle w:val="Heading3"/>
@@ -19328,8 +19610,8 @@
         <w:t xml:space="preserve">When these features ship, the tier comparison widget on the personal invitation site auto-updates the registered-tier descriptions; no copy changes needed because the widget reads feature flags from a config.</w:t>
       </w:r>
     </w:p>
-    <w:bookmarkEnd w:id="76"/>
-    <w:bookmarkStart w:id="77" w:name="out-of-scope-deferred"/>
+    <w:bookmarkEnd w:id="77"/>
+    <w:bookmarkStart w:id="78" w:name="out-of-scope-deferred"/>
     <w:p>
       <w:pPr>
         <w:pStyle w:val="Heading3"/>
@@ -19539,9 +19821,9 @@
         </w:pict>
       </w:r>
     </w:p>
-    <w:bookmarkEnd w:id="77"/>
     <w:bookmarkEnd w:id="78"/>
-    <w:bookmarkStart w:id="79" w:name="acceptance-criteria"/>
+    <w:bookmarkEnd w:id="79"/>
+    <w:bookmarkStart w:id="80" w:name="acceptance-criteria"/>
     <w:p>
       <w:pPr>
         <w:pStyle w:val="Heading2"/>
@@ -20714,8 +20996,8 @@
         </w:pict>
       </w:r>
     </w:p>
-    <w:bookmarkEnd w:id="79"/>
-    <w:bookmarkStart w:id="80" w:name="privacy-compliance"/>
+    <w:bookmarkEnd w:id="80"/>
+    <w:bookmarkStart w:id="81" w:name="privacy-compliance"/>
     <w:p>
       <w:pPr>
         <w:pStyle w:val="Heading2"/>
@@ -20851,8 +21133,8 @@
         </w:pict>
       </w:r>
     </w:p>
-    <w:bookmarkEnd w:id="80"/>
-    <w:bookmarkStart w:id="81" w:name="companion-files-to-read-before-starting"/>
+    <w:bookmarkEnd w:id="81"/>
+    <w:bookmarkStart w:id="82" w:name="companion-files-to-read-before-starting"/>
     <w:p>
       <w:pPr>
         <w:pStyle w:val="Heading2"/>
@@ -21024,8 +21306,8 @@
         </w:pict>
       </w:r>
     </w:p>
-    <w:bookmarkEnd w:id="81"/>
-    <w:bookmarkStart w:id="82" w:name="notes-for-claude-code"/>
+    <w:bookmarkEnd w:id="82"/>
+    <w:bookmarkStart w:id="83" w:name="notes-for-claude-code"/>
     <w:p>
       <w:pPr>
         <w:pStyle w:val="Heading2"/>
@@ -21222,8 +21504,8 @@
         <w:t xml:space="preserve">(in this same folder) describing what was built, what schema migrations ran, what was deferred, and any decisions you made worth surfacing.</w:t>
       </w:r>
     </w:p>
-    <w:bookmarkEnd w:id="82"/>
     <w:bookmarkEnd w:id="83"/>
+    <w:bookmarkEnd w:id="84"/>
     <w:sectPr>
       <w:footnotePr>
         <w:numRestart w:val="eachSect"/>

</xml_diff>